<commit_message>
Ch. 2 (Klasicni modeli kontrole pristupa): write chapter, add 4 references
</commit_message>
<xml_diff>
--- a/Tema 2. - Kontrola pristupa i sigurnosni modeli u MySQL bazi podataka/rad.docx
+++ b/Tema 2. - Kontrola pristupa i sigurnosni modeli u MySQL bazi podataka/rad.docx
@@ -244,7 +244,7 @@
         <w:br w:type="page"/>
       </w:r>
     </w:p>
-    <w:bookmarkStart w:id="15" w:name="uvod"/>
+    <w:bookmarkStart w:id="9" w:name="uvod"/>
     <w:p>
       <w:pPr>
         <w:pStyle w:val="Heading1"/>
@@ -529,8 +529,942 @@
         <w:t xml:space="preserve">postavljenu u ovom uvodu.</w:t>
       </w:r>
     </w:p>
-    <w:bookmarkStart w:id="14" w:name="refs"/>
-    <w:bookmarkStart w:id="9" w:name="ref-ramakrishnan2003"/>
+    <w:bookmarkEnd w:id="9"/>
+    <w:bookmarkStart w:id="24" w:name="klasični-modeli-kontrole-pristupa"/>
+    <w:p>
+      <w:pPr>
+        <w:pStyle w:val="Heading1"/>
+      </w:pPr>
+      <w:r>
+        <w:t xml:space="preserve">2. Klasični modeli kontrole pristupa</w:t>
+      </w:r>
+    </w:p>
+    <w:p>
+      <w:pPr>
+        <w:pStyle w:val="FirstParagraph"/>
+      </w:pPr>
+      <w:r>
+        <w:t xml:space="preserve">Svaki zahtev za pristup podacima može se opisati trojkom (subjekat, objekat, operacija): subjekat je</w:t>
+      </w:r>
+      <w:r>
+        <w:t xml:space="preserve"> </w:t>
+      </w:r>
+      <w:r>
+        <w:t xml:space="preserve">korisnik ili aplikacija koja pokreće zahtev, objekat je resurs nad kojim se zahtev izvršava (tabela,</w:t>
+      </w:r>
+      <w:r>
+        <w:t xml:space="preserve"> </w:t>
+      </w:r>
+      <w:r>
+        <w:t xml:space="preserve">pogled, kolona), a operacija je radnja koja se nad objektom traži (čitanje, upisivanje, brisanje)</w:t>
+      </w:r>
+      <w:r>
+        <w:t xml:space="preserve"> </w:t>
+      </w:r>
+      <w:r>
+        <w:t xml:space="preserve">[1]</w:t>
+      </w:r>
+      <w:r>
+        <w:t xml:space="preserve">. Nad tom trojkom sistem primenjuje politiku pristupa, skup pravila koja određuju</w:t>
+      </w:r>
+      <w:r>
+        <w:t xml:space="preserve"> </w:t>
+      </w:r>
+      <w:r>
+        <w:t xml:space="preserve">koje trojke su dozvoljene, posredstvom mehanizma sigurnosti, tehničkog sredstva koje tu politiku</w:t>
+      </w:r>
+      <w:r>
+        <w:t xml:space="preserve"> </w:t>
+      </w:r>
+      <w:r>
+        <w:t xml:space="preserve">sprovodi u svakom pojedinačnom zahtevu; razdvajanje politike od mehanizma omogućava da se ista</w:t>
+      </w:r>
+      <w:r>
+        <w:t xml:space="preserve"> </w:t>
+      </w:r>
+      <w:r>
+        <w:t xml:space="preserve">implementacija koristi za različita pravila, bez izmene same baze podataka</w:t>
+      </w:r>
+      <w:r>
+        <w:t xml:space="preserve"> </w:t>
+      </w:r>
+      <w:r>
+        <w:t xml:space="preserve">[1]</w:t>
+      </w:r>
+      <w:r>
+        <w:t xml:space="preserve">. Ova</w:t>
+      </w:r>
+      <w:r>
+        <w:t xml:space="preserve"> </w:t>
+      </w:r>
+      <w:r>
+        <w:t xml:space="preserve">trojka je istovremeno i granica klasičnih modela: nijedan od njih ne ume da izrazi pravilo koje zavisi</w:t>
+      </w:r>
+      <w:r>
+        <w:t xml:space="preserve"> </w:t>
+      </w:r>
+      <w:r>
+        <w:t xml:space="preserve">od same vrednosti podatka (na primer, „dozvoli izmenu samo ako je status različit od</w:t>
+      </w:r>
+      <w:r>
+        <w:t xml:space="preserve"> </w:t>
+      </w:r>
+      <w:r>
+        <w:t xml:space="preserve">‘otkazan’</w:t>
+      </w:r>
+      <w:r>
+        <w:t xml:space="preserve">“), jer</w:t>
+      </w:r>
+      <w:r>
+        <w:t xml:space="preserve"> </w:t>
+      </w:r>
+      <w:r>
+        <w:t xml:space="preserve">vrednost nije deo trojke (subjekat, objekat, operacija)</w:t>
+      </w:r>
+      <w:r>
+        <w:t xml:space="preserve"> </w:t>
+      </w:r>
+      <w:r>
+        <w:t xml:space="preserve">[1]</w:t>
+      </w:r>
+      <w:r>
+        <w:t xml:space="preserve">. Ovo ograničenje se</w:t>
+      </w:r>
+      <w:r>
+        <w:t xml:space="preserve"> </w:t>
+      </w:r>
+      <w:r>
+        <w:t xml:space="preserve">ponovo javlja u četvrtom poglavlju, kada se pokaže da MySQL nema izvornu podršku za bezbednost na</w:t>
+      </w:r>
+      <w:r>
+        <w:t xml:space="preserve"> </w:t>
+      </w:r>
+      <w:r>
+        <w:t xml:space="preserve">nivou reda upravo zato što grant sistem odlučuje na nivou objekta, ne na nivou vrednosti.</w:t>
+      </w:r>
+    </w:p>
+    <w:p>
+      <w:pPr>
+        <w:pStyle w:val="BodyText"/>
+      </w:pPr>
+      <w:r>
+        <w:t xml:space="preserve">Diskreciona kontrola pristupa (DAC) rešava pitanje ko odlučuje o pristupu na jedan konkretan način:</w:t>
+      </w:r>
+      <w:r>
+        <w:t xml:space="preserve"> </w:t>
+      </w:r>
+      <w:r>
+        <w:t xml:space="preserve">odluku donosi vlasnik objekta. Kada subjekat kreira objekat, on nad njim automatski dobija sva prava,</w:t>
+      </w:r>
+      <w:r>
+        <w:t xml:space="preserve"> </w:t>
+      </w:r>
+      <w:r>
+        <w:t xml:space="preserve">uključujući i pravo da ta prava dodeli drugim subjektima; ako je dodela praćena eksplicitnom opcijom</w:t>
+      </w:r>
+      <w:r>
+        <w:t xml:space="preserve"> </w:t>
+      </w:r>
+      <w:r>
+        <w:t xml:space="preserve">prenosa prava, primalac može dalje dodeljivati isto pravo trećim subjektima, čime nastaje lanac</w:t>
+      </w:r>
+      <w:r>
+        <w:t xml:space="preserve"> </w:t>
+      </w:r>
+      <w:r>
+        <w:t xml:space="preserve">delegacije čiji je koren uvek vlasnik</w:t>
+      </w:r>
+      <w:r>
+        <w:t xml:space="preserve"> </w:t>
+      </w:r>
+      <w:r>
+        <w:t xml:space="preserve">[1]</w:t>
+      </w:r>
+      <w:r>
+        <w:t xml:space="preserve">. Standard SQL propisuje da se takav lanac</w:t>
+      </w:r>
+      <w:r>
+        <w:t xml:space="preserve"> </w:t>
+      </w:r>
+      <w:r>
+        <w:t xml:space="preserve">ponaša simetrično i pri oduzimanju: kaskadno oduzimanje prava povlači za sobom oduzimanje svih prava</w:t>
+      </w:r>
+      <w:r>
+        <w:t xml:space="preserve"> </w:t>
+      </w:r>
+      <w:r>
+        <w:t xml:space="preserve">koja su na osnovu njega dalje dodeljena, tako da uklanjanje korena lanca uklanja i sve njegove grane</w:t>
+      </w:r>
+      <w:r>
+        <w:t xml:space="preserve"> </w:t>
+      </w:r>
+      <w:r>
+        <w:t xml:space="preserve">[1]</w:t>
+      </w:r>
+      <w:r>
+        <w:t xml:space="preserve">. Ovde vredi primetiti da opcija prenosa prava nije proizvoljna velikodušnost</w:t>
+      </w:r>
+      <w:r>
+        <w:t xml:space="preserve"> </w:t>
+      </w:r>
+      <w:r>
+        <w:t xml:space="preserve">sistema prema vlasniku, već nužna posledica same definicije DAC-a: kada bi sistem zabranio vlasniku</w:t>
+      </w:r>
+      <w:r>
+        <w:t xml:space="preserve"> </w:t>
+      </w:r>
+      <w:r>
+        <w:t xml:space="preserve">da dalje delegira sopstveno pravo, ta zabrana bi sama predstavljala pravilo koje vlasnik ne bi mogao</w:t>
+      </w:r>
+      <w:r>
+        <w:t xml:space="preserve"> </w:t>
+      </w:r>
+      <w:r>
+        <w:t xml:space="preserve">da zaobiđe, odnosno klicu obavezne kontrole pristupa unutar modela koji je po definiciji diskrecion.</w:t>
+      </w:r>
+    </w:p>
+    <w:p>
+      <w:pPr>
+        <w:pStyle w:val="BodyText"/>
+      </w:pPr>
+      <w:r>
+        <w:t xml:space="preserve">MySQL sledi upravo ovaj obrazac dodele, ali se namerno udaljava od standarda u pitanju oduzimanja:</w:t>
+      </w:r>
+      <w:r>
+        <w:t xml:space="preserve"> </w:t>
+      </w:r>
+      <w:r>
+        <w:t xml:space="preserve">prema sopstvenom priručniku, oduzimanje privilegije u MySQL-u ne povlači automatski oduzimanje</w:t>
+      </w:r>
+      <w:r>
+        <w:t xml:space="preserve"> </w:t>
+      </w:r>
+      <w:r>
+        <w:t xml:space="preserve">privilegija koje su na osnovu nje dodeljene drugim korisnicima</w:t>
+      </w:r>
+      <w:r>
+        <w:t xml:space="preserve"> </w:t>
+      </w:r>
+      <w:r>
+        <w:t xml:space="preserve">[2]</w:t>
+      </w:r>
+      <w:r>
+        <w:t xml:space="preserve">. To odsustvo kaskade</w:t>
+      </w:r>
+      <w:r>
+        <w:t xml:space="preserve"> </w:t>
+      </w:r>
+      <w:r>
+        <w:t xml:space="preserve">nije posledica nedostatka podataka o poreklu dodele: MySQL u tabeli</w:t>
+      </w:r>
+      <w:r>
+        <w:t xml:space="preserve"> </w:t>
+      </w:r>
+      <w:r>
+        <w:rPr>
+          <w:rStyle w:val="VerbatimChar"/>
+        </w:rPr>
+        <w:t xml:space="preserve">mysql.tables_priv</w:t>
+      </w:r>
+      <w:r>
+        <w:t xml:space="preserve"> </w:t>
+      </w:r>
+      <w:r>
+        <w:t xml:space="preserve">čuva kolonu</w:t>
+      </w:r>
+      <w:r>
+        <w:t xml:space="preserve"> </w:t>
+      </w:r>
+      <w:r>
+        <w:rPr>
+          <w:rStyle w:val="VerbatimChar"/>
+        </w:rPr>
+        <w:t xml:space="preserve">Grantor</w:t>
+      </w:r>
+      <w:r>
+        <w:t xml:space="preserve">, koju priručnik opisuje kao vrednost koja se postavlja pri dodeli, ali se „inače ne</w:t>
+      </w:r>
+      <w:r>
+        <w:t xml:space="preserve"> </w:t>
+      </w:r>
+      <w:r>
+        <w:t xml:space="preserve">koristi”</w:t>
+      </w:r>
+      <w:r>
+        <w:t xml:space="preserve"> </w:t>
+      </w:r>
+      <w:r>
+        <w:t xml:space="preserve">[2]</w:t>
+      </w:r>
+      <w:r>
+        <w:t xml:space="preserve">, što odsustvo kaskadnog oduzimanja čini svesnom projektantskom odlukom, a</w:t>
+      </w:r>
+      <w:r>
+        <w:t xml:space="preserve"> </w:t>
+      </w:r>
+      <w:r>
+        <w:t xml:space="preserve">ne tehničkim ograničenjem. Ista provera pokazuje i da opcija prenosa prava nadživljava oduzimanje</w:t>
+      </w:r>
+      <w:r>
+        <w:t xml:space="preserve"> </w:t>
+      </w:r>
+      <w:r>
+        <w:t xml:space="preserve">privilegije na koju se odnosi: nalog kome je oduzeto pravo čitanja i dalje zadržava mogućnost da to</w:t>
+      </w:r>
+      <w:r>
+        <w:t xml:space="preserve"> </w:t>
+      </w:r>
+      <w:r>
+        <w:t xml:space="preserve">pravo, ako mu bude ponovo dodeljeno, prenosi na druge naloge, sve dok mu se izričito ne oduzme i sama</w:t>
+      </w:r>
+      <w:r>
+        <w:t xml:space="preserve"> </w:t>
+      </w:r>
+      <w:r>
+        <w:t xml:space="preserve">opcija prenosa</w:t>
+      </w:r>
+      <w:r>
+        <w:t xml:space="preserve"> </w:t>
+      </w:r>
+      <w:r>
+        <w:t xml:space="preserve">[2]</w:t>
+      </w:r>
+      <w:r>
+        <w:t xml:space="preserve">. Oba nalaza pokazuju da DAC, kao teorijski model, ne propisuje samo</w:t>
+      </w:r>
+      <w:r>
+        <w:t xml:space="preserve"> </w:t>
+      </w:r>
+      <w:r>
+        <w:t xml:space="preserve">pravac oduzimanja prava, već da svaka implementacija bira sopstveno tumačenje te tačke modela, što</w:t>
+      </w:r>
+      <w:r>
+        <w:t xml:space="preserve"> </w:t>
+      </w:r>
+      <w:r>
+        <w:t xml:space="preserve">treće poglavlje razmatra u celini na primeru MySQL-ovog sistema privilegija.</w:t>
+      </w:r>
+    </w:p>
+    <w:p>
+      <w:pPr>
+        <w:pStyle w:val="BodyText"/>
+      </w:pPr>
+      <w:r>
+        <w:t xml:space="preserve">Granica same DAC diskrecije najbolje se vidi kroz argument poznat kao trojanski konj. Subjekat sa</w:t>
+      </w:r>
+      <w:r>
+        <w:t xml:space="preserve"> </w:t>
+      </w:r>
+      <w:r>
+        <w:t xml:space="preserve">legitimnim pravom čitanja poverljivog objekta može pokrenuti program koji, uz njegovu privilegiju,</w:t>
+      </w:r>
+      <w:r>
+        <w:t xml:space="preserve"> </w:t>
+      </w:r>
+      <w:r>
+        <w:t xml:space="preserve">pročita sadržaj tog objekta i tajno ga upiše u drugi objekat nad kojim pravo pisanja ima napadač, iako</w:t>
+      </w:r>
+      <w:r>
+        <w:t xml:space="preserve"> </w:t>
+      </w:r>
+      <w:r>
+        <w:t xml:space="preserve">napadač nikada nije dobio pravo čitanja izvornog objekta; DAC ovaj tok informacija ne sprečava jer se</w:t>
+      </w:r>
+      <w:r>
+        <w:t xml:space="preserve"> </w:t>
+      </w:r>
+      <w:r>
+        <w:t xml:space="preserve">provera prava vršila u trenutku pristupa legitimnog subjekta, a ne u trenutku kada je informacija</w:t>
+      </w:r>
+      <w:r>
+        <w:t xml:space="preserve"> </w:t>
+      </w:r>
+      <w:r>
+        <w:t xml:space="preserve">napustila objekat u koji je upisana</w:t>
+      </w:r>
+      <w:r>
+        <w:t xml:space="preserve"> </w:t>
+      </w:r>
+      <w:r>
+        <w:t xml:space="preserve">[1]</w:t>
+      </w:r>
+      <w:r>
+        <w:t xml:space="preserve">. Pošto DAC kontroliše ko sme da pristupi</w:t>
+      </w:r>
+      <w:r>
+        <w:t xml:space="preserve"> </w:t>
+      </w:r>
+      <w:r>
+        <w:t xml:space="preserve">objektu, a ne kuda dalje putuje informacija koja iz njega izađe, ovaj propust nije greška u</w:t>
+      </w:r>
+      <w:r>
+        <w:t xml:space="preserve"> </w:t>
+      </w:r>
+      <w:r>
+        <w:t xml:space="preserve">implementaciji nego posledica same definicije modela, i predstavlja motivaciju za uvođenje modela</w:t>
+      </w:r>
+      <w:r>
+        <w:t xml:space="preserve"> </w:t>
+      </w:r>
+      <w:r>
+        <w:t xml:space="preserve">koji nadzire tok informacija nezavisno od volje vlasnika.</w:t>
+      </w:r>
+    </w:p>
+    <w:p>
+      <w:pPr>
+        <w:pStyle w:val="BodyText"/>
+      </w:pPr>
+      <w:r>
+        <w:t xml:space="preserve">Obavezna kontrola pristupa (MAC) tu prazninu popunjava tako što odluku o pristupu prepušta</w:t>
+      </w:r>
+      <w:r>
+        <w:t xml:space="preserve"> </w:t>
+      </w:r>
+      <w:r>
+        <w:t xml:space="preserve">centralnom autoritetu, a ne vlasniku objekta: svakom subjektu se dodeljuje dozvola (klasa sigurnosti),</w:t>
+      </w:r>
+      <w:r>
+        <w:t xml:space="preserve"> </w:t>
+      </w:r>
+      <w:r>
+        <w:t xml:space="preserve">a svakom objektu klasa sigurnosti, i nijedan subjekat, uključujući vlasnika, ne može tu klasifikaciju</w:t>
+      </w:r>
+      <w:r>
+        <w:t xml:space="preserve"> </w:t>
+      </w:r>
+      <w:r>
+        <w:t xml:space="preserve">sam da promeni niti dodeljeno pravo da prenese na drugog subjekta</w:t>
+      </w:r>
+      <w:r>
+        <w:t xml:space="preserve"> </w:t>
+      </w:r>
+      <w:r>
+        <w:t xml:space="preserve">[1]</w:t>
+      </w:r>
+      <w:r>
+        <w:t xml:space="preserve">. Najpoznatiji</w:t>
+      </w:r>
+      <w:r>
+        <w:t xml:space="preserve"> </w:t>
+      </w:r>
+      <w:r>
+        <w:t xml:space="preserve">formalni model MAC-a, Bell-LaPadula, propisuje dva pravila nad uređenim skupom klasa sigurnosti</w:t>
+      </w:r>
+      <w:r>
+        <w:t xml:space="preserve"> </w:t>
+      </w:r>
+      <w:r>
+        <w:t xml:space="preserve">[4]</w:t>
+      </w:r>
+      <w:r>
+        <w:t xml:space="preserve">. Simple Security Property (pravilo „bez čitanja naviše”) dozvoljava subjektu S da čita</w:t>
+      </w:r>
+      <w:r>
+        <w:t xml:space="preserve"> </w:t>
+      </w:r>
+      <w:r>
+        <w:t xml:space="preserve">objekat O samo ako je klasa(S) ≥ klasa(O), čime se sprečava da subjekat niže dozvole pročita podatak</w:t>
+      </w:r>
+      <w:r>
+        <w:t xml:space="preserve"> </w:t>
+      </w:r>
+      <w:r>
+        <w:t xml:space="preserve">više poverljivosti. *-Property (pravilo „bez upisa naniže”) dozvoljava subjektu S da upisuje u objekat</w:t>
+      </w:r>
+      <w:r>
+        <w:t xml:space="preserve"> </w:t>
+      </w:r>
+      <w:r>
+        <w:t xml:space="preserve">O samo ako je klasa(S) ≤ klasa(O), čime se sprečava da subjekat koji je pročitao poverljiv podatak taj</w:t>
+      </w:r>
+      <w:r>
+        <w:t xml:space="preserve"> </w:t>
+      </w:r>
+      <w:r>
+        <w:t xml:space="preserve">podatak dalje prenese upisom u objekat niže klase, i time zatvara upravo onaj tok informacija koji</w:t>
+      </w:r>
+      <w:r>
+        <w:t xml:space="preserve"> </w:t>
+      </w:r>
+      <w:r>
+        <w:t xml:space="preserve">trojanski konj koristi protiv DAC-a</w:t>
+      </w:r>
+      <w:r>
+        <w:t xml:space="preserve"> </w:t>
+      </w:r>
+      <w:r>
+        <w:t xml:space="preserve">[4]</w:t>
+      </w:r>
+      <w:r>
+        <w:t xml:space="preserve">. Slika 2.1 prikazuje oba pravila za subjekta na</w:t>
+      </w:r>
+      <w:r>
+        <w:t xml:space="preserve"> </w:t>
+      </w:r>
+      <w:r>
+        <w:t xml:space="preserve">srednjem nivou poverljivosti: čitanje je dozvoljeno samo naniže ili u istom nivou, upis samo naviše</w:t>
+      </w:r>
+      <w:r>
+        <w:t xml:space="preserve"> </w:t>
+      </w:r>
+      <w:r>
+        <w:t xml:space="preserve">ili u istom nivou, tako da informacija u sistemu sme da teče isključivo naviše.</w:t>
+      </w:r>
+    </w:p>
+    <w:p>
+      <w:pPr>
+        <w:pStyle w:val="CaptionedFigure"/>
+      </w:pPr>
+      <w:r>
+        <w:drawing>
+          <wp:inline>
+            <wp:extent cx="4027170" cy="2278530"/>
+            <wp:effectExtent b="0" l="0" r="0" t="0"/>
+            <wp:docPr descr="Slika 2.1: Bell-LaPadula - informacija sme da teče samo naviše" title="" id="11" name="Picture"/>
+            <a:graphic>
+              <a:graphicData uri="http://schemas.openxmlformats.org/drawingml/2006/picture">
+                <pic:pic>
+                  <pic:nvPicPr>
+                    <pic:cNvPr descr="figures/02-klasicni-modeli-01-bell-lapadula.png" id="12" name="Picture"/>
+                    <pic:cNvPicPr>
+                      <a:picLocks noChangeArrowheads="1" noChangeAspect="1"/>
+                    </pic:cNvPicPr>
+                  </pic:nvPicPr>
+                  <pic:blipFill>
+                    <a:blip r:embed="rId10"/>
+                    <a:stretch>
+                      <a:fillRect/>
+                    </a:stretch>
+                  </pic:blipFill>
+                  <pic:spPr bwMode="auto">
+                    <a:xfrm>
+                      <a:off x="0" y="0"/>
+                      <a:ext cx="4027170" cy="2278530"/>
+                    </a:xfrm>
+                    <a:prstGeom prst="rect">
+                      <a:avLst/>
+                    </a:prstGeom>
+                    <a:noFill/>
+                    <a:ln w="9525">
+                      <a:noFill/>
+                      <a:headEnd/>
+                      <a:tailEnd/>
+                    </a:ln>
+                  </pic:spPr>
+                </pic:pic>
+              </a:graphicData>
+            </a:graphic>
+          </wp:inline>
+        </w:drawing>
+      </w:r>
+    </w:p>
+    <w:p>
+      <w:pPr>
+        <w:pStyle w:val="ImageCaption"/>
+      </w:pPr>
+      <w:r>
+        <w:t xml:space="preserve">Slika 2.1: Bell-LaPadula - informacija sme da teče samo naviše</w:t>
+      </w:r>
+    </w:p>
+    <w:p>
+      <w:pPr>
+        <w:pStyle w:val="BodyText"/>
+      </w:pPr>
+      <w:r>
+        <w:t xml:space="preserve">Vredi naglasiti da su oba Bell-LaPadula pravila usmerena na zaštitu tajnosti, ne integriteta:</w:t>
+      </w:r>
+      <w:r>
+        <w:t xml:space="preserve"> </w:t>
+      </w:r>
+      <w:r>
+        <w:t xml:space="preserve">subjekat niže dozvole nikada ne sme da pročita poverljiviji podatak, ali mu ništa ne brani da upiše u</w:t>
+      </w:r>
+      <w:r>
+        <w:t xml:space="preserve"> </w:t>
+      </w:r>
+      <w:r>
+        <w:t xml:space="preserve">objekat više klase, takozvani „slepi upis”, čime se poverljivi podatak može oštetiti a da ga napadač</w:t>
+      </w:r>
+      <w:r>
+        <w:t xml:space="preserve"> </w:t>
+      </w:r>
+      <w:r>
+        <w:t xml:space="preserve">nikada nije video; zaštita integriteta u prisustvu MAC-a zahteva poseban, dualan model (Biba), koji</w:t>
+      </w:r>
+      <w:r>
+        <w:t xml:space="preserve"> </w:t>
+      </w:r>
+      <w:r>
+        <w:t xml:space="preserve">pravila čitanja i upisa okreće u suprotnom smeru</w:t>
+      </w:r>
+      <w:r>
+        <w:t xml:space="preserve"> </w:t>
+      </w:r>
+      <w:r>
+        <w:t xml:space="preserve">[1]</w:t>
+      </w:r>
+      <w:r>
+        <w:t xml:space="preserve">. Zbog stroge, sistemski nametnute</w:t>
+      </w:r>
+      <w:r>
+        <w:t xml:space="preserve"> </w:t>
+      </w:r>
+      <w:r>
+        <w:t xml:space="preserve">klasifikacije i nemogućnosti da je bilo koji korisnik zaobiđe, MAC u praksi znatno otežava svakodnevni</w:t>
+      </w:r>
+      <w:r>
+        <w:t xml:space="preserve"> </w:t>
+      </w:r>
+      <w:r>
+        <w:t xml:space="preserve">rad, uključujući situacije u kojima nijedan subjekat ne poseduje dovoljno visoku dozvolu za rutinski</w:t>
+      </w:r>
+      <w:r>
+        <w:t xml:space="preserve"> </w:t>
+      </w:r>
+      <w:r>
+        <w:t xml:space="preserve">zadatak, zbog čega se u komercijalnim sistemima retko sreće i preživljava uglavnom u specijalizovanim,</w:t>
+      </w:r>
+      <w:r>
+        <w:t xml:space="preserve"> </w:t>
+      </w:r>
+      <w:r>
+        <w:t xml:space="preserve">vojnim primenama</w:t>
+      </w:r>
+      <w:r>
+        <w:t xml:space="preserve"> </w:t>
+      </w:r>
+      <w:r>
+        <w:t xml:space="preserve">[1]</w:t>
+      </w:r>
+      <w:r>
+        <w:t xml:space="preserve">.</w:t>
+      </w:r>
+    </w:p>
+    <w:p>
+      <w:pPr>
+        <w:pStyle w:val="BodyText"/>
+      </w:pPr>
+      <w:r>
+        <w:t xml:space="preserve">Blisko srodan problem, koji klasična trojka (subjekat, objekat, operacija) takođe ne rešava, jeste</w:t>
+      </w:r>
+      <w:r>
+        <w:t xml:space="preserve"> </w:t>
+      </w:r>
+      <w:r>
+        <w:t xml:space="preserve">problem statističke baze podataka: sistem koji dozvoljava samo agregirane upite (na primer, prosek ili</w:t>
+      </w:r>
+      <w:r>
+        <w:t xml:space="preserve"> </w:t>
+      </w:r>
+      <w:r>
+        <w:t xml:space="preserve">broj zapisa koji zadovoljavaju uslov) može otkriti pojedinačnu, poverljivu vrednost ako se napadaču</w:t>
+      </w:r>
+      <w:r>
+        <w:t xml:space="preserve"> </w:t>
+      </w:r>
+      <w:r>
+        <w:t xml:space="preserve">dozvoli da postavi niz pažljivo odabranih agregiranih upita, na primer tako što uporedi broj zaposlenih</w:t>
+      </w:r>
+      <w:r>
+        <w:t xml:space="preserve"> </w:t>
+      </w:r>
+      <w:r>
+        <w:t xml:space="preserve">starijih od X godina sa brojem starijih od X+1 godina i iz razlike izvede podatak o tačno jednoj osobi</w:t>
+      </w:r>
+      <w:r>
+        <w:t xml:space="preserve"> </w:t>
+      </w:r>
+      <w:r>
+        <w:t xml:space="preserve">[1]</w:t>
+      </w:r>
+      <w:r>
+        <w:t xml:space="preserve">. Ni DAC ni MAC ovaj problem ne rešavaju, jer oba modela odlučuju o pristupu samom</w:t>
+      </w:r>
+      <w:r>
+        <w:t xml:space="preserve"> </w:t>
+      </w:r>
+      <w:r>
+        <w:t xml:space="preserve">objektu, a ne o tome šta se iz niza dozvoljenih upita može zaključiti; problem ostaje otvoren i u</w:t>
+      </w:r>
+      <w:r>
+        <w:t xml:space="preserve"> </w:t>
+      </w:r>
+      <w:r>
+        <w:t xml:space="preserve">savremenim sistemima poput MySQL-a, koji nemaju poseban mehanizam za njegovo sprečavanje.</w:t>
+      </w:r>
+    </w:p>
+    <w:p>
+      <w:pPr>
+        <w:pStyle w:val="BodyText"/>
+      </w:pPr>
+      <w:r>
+        <w:t xml:space="preserve">Kontrola pristupa zasnovana na ulogama (RBAC) uvodi osu koja je nezavisna od para DAC/MAC: umesto da</w:t>
+      </w:r>
+      <w:r>
+        <w:t xml:space="preserve"> </w:t>
+      </w:r>
+      <w:r>
+        <w:t xml:space="preserve">se pravo dodeljuje direktno subjektu ili da o njemu odlučuje centralni autoritet preko klase</w:t>
+      </w:r>
+      <w:r>
+        <w:t xml:space="preserve"> </w:t>
+      </w:r>
+      <w:r>
+        <w:t xml:space="preserve">sigurnosti, pravo se dodeljuje ulozi, imenovanom skupu privilegija koji odgovara funkciji u</w:t>
+      </w:r>
+      <w:r>
+        <w:t xml:space="preserve"> </w:t>
+      </w:r>
+      <w:r>
+        <w:t xml:space="preserve">organizaciji, a subjektu se dodeljuje uloga</w:t>
+      </w:r>
+      <w:r>
+        <w:t xml:space="preserve"> </w:t>
+      </w:r>
+      <w:r>
+        <w:t xml:space="preserve">[3]</w:t>
+      </w:r>
+      <w:r>
+        <w:t xml:space="preserve">. Sandhu i saradnici formalizuju RBAC kroz</w:t>
+      </w:r>
+      <w:r>
+        <w:t xml:space="preserve"> </w:t>
+      </w:r>
+      <w:r>
+        <w:t xml:space="preserve">niz od četiri modela rastuće izražajnosti: RBAC0, osnovni model dodele uloga i privilegija; RBAC1, koji</w:t>
+      </w:r>
+      <w:r>
+        <w:t xml:space="preserve"> </w:t>
+      </w:r>
+      <w:r>
+        <w:t xml:space="preserve">dodaje hijerarhiju uloga u kojoj viša uloga nasleđuje privilegije nižih; RBAC2, koji dodaje ograničenja</w:t>
+      </w:r>
+      <w:r>
+        <w:t xml:space="preserve"> </w:t>
+      </w:r>
+      <w:r>
+        <w:t xml:space="preserve">poput razdvajanja dužnosti, pravila da isti subjekat ne sme istovremeno da drži dve međusobno</w:t>
+      </w:r>
+      <w:r>
+        <w:t xml:space="preserve"> </w:t>
+      </w:r>
+      <w:r>
+        <w:t xml:space="preserve">sukobljene uloge; i RBAC3, koji objedinjuje hijerarhiju i ograničenja</w:t>
+      </w:r>
+      <w:r>
+        <w:t xml:space="preserve"> </w:t>
+      </w:r>
+      <w:r>
+        <w:t xml:space="preserve">[3]</w:t>
+      </w:r>
+      <w:r>
+        <w:t xml:space="preserve">. Nezavisno od</w:t>
+      </w:r>
+      <w:r>
+        <w:t xml:space="preserve"> </w:t>
+      </w:r>
+      <w:r>
+        <w:t xml:space="preserve">Sandhua i saradnika, Ferraiolo i Kuhn dolaze do istog zaključka analizom komercijalnih sistema:</w:t>
+      </w:r>
+      <w:r>
+        <w:t xml:space="preserve"> </w:t>
+      </w:r>
+      <w:r>
+        <w:t xml:space="preserve">privilegije organizovane oko uloga bolje prate stvarnu strukturu ovlašćenja u jednoj organizaciji nego</w:t>
+      </w:r>
+      <w:r>
+        <w:t xml:space="preserve"> </w:t>
+      </w:r>
+      <w:r>
+        <w:t xml:space="preserve">privilegije dodeljene pojedinačnim korisnicima, i lakše se održavaju kada zaposleni menja posao ili</w:t>
+      </w:r>
+      <w:r>
+        <w:t xml:space="preserve"> </w:t>
+      </w:r>
+      <w:r>
+        <w:t xml:space="preserve">napušta organizaciju</w:t>
+      </w:r>
+      <w:r>
+        <w:t xml:space="preserve"> </w:t>
+      </w:r>
+      <w:r>
+        <w:t xml:space="preserve">[5]</w:t>
+      </w:r>
+      <w:r>
+        <w:t xml:space="preserve">. Ova dva nezavisna izvora kasnije su objedinjena u formalni</w:t>
+      </w:r>
+      <w:r>
+        <w:t xml:space="preserve"> </w:t>
+      </w:r>
+      <w:r>
+        <w:t xml:space="preserve">standard ANSI/INCITS 359-2004, koji RBAC definiše kroz sesiju u kojoj subjekat aktivira podskup uloga</w:t>
+      </w:r>
+      <w:r>
+        <w:t xml:space="preserve"> </w:t>
+      </w:r>
+      <w:r>
+        <w:t xml:space="preserve">koje mu je administrator dodelio, tako da su u svakom trenutku na snazi samo privilegije aktivnih</w:t>
+      </w:r>
+      <w:r>
+        <w:t xml:space="preserve"> </w:t>
+      </w:r>
+      <w:r>
+        <w:t xml:space="preserve">uloga, ne sve privilegije koje subjekat uopšte poseduje</w:t>
+      </w:r>
+      <w:r>
+        <w:t xml:space="preserve"> </w:t>
+      </w:r>
+      <w:r>
+        <w:t xml:space="preserve">[6]</w:t>
+      </w:r>
+      <w:r>
+        <w:t xml:space="preserve">. Upravo ta razlika, između svih</w:t>
+      </w:r>
+      <w:r>
+        <w:t xml:space="preserve"> </w:t>
+      </w:r>
+      <w:r>
+        <w:t xml:space="preserve">dodeljenih uloga i uloga aktivnih u tekućoj sesiji, jeste tačka na kojoj treće poglavlje proverava da</w:t>
+      </w:r>
+      <w:r>
+        <w:t xml:space="preserve"> </w:t>
+      </w:r>
+      <w:r>
+        <w:t xml:space="preserve">li MySQL-ove uloge zaista predstavljaju RBAC u ovom, formalnom smislu.</w:t>
+      </w:r>
+    </w:p>
+    <w:p>
+      <w:pPr>
+        <w:pStyle w:val="BodyText"/>
+      </w:pPr>
+      <w:r>
+        <w:t xml:space="preserve">Kroz sve prethodno izložene modele provlači se jedan zajednički zahtev, koji Saltzer i Šreder</w:t>
+      </w:r>
+      <w:r>
+        <w:t xml:space="preserve"> </w:t>
+      </w:r>
+      <w:r>
+        <w:t xml:space="preserve">formulišu kao princip najmanjih privilegija: „svaki program i svaki korisnik sistema treba da radi</w:t>
+      </w:r>
+      <w:r>
+        <w:t xml:space="preserve"> </w:t>
+      </w:r>
+      <w:r>
+        <w:t xml:space="preserve">koristeći najmanji skup privilegija neophodan za obavljanje posla”</w:t>
+      </w:r>
+      <w:r>
+        <w:t xml:space="preserve"> </w:t>
+      </w:r>
+      <w:r>
+        <w:t xml:space="preserve">[7]</w:t>
+      </w:r>
+      <w:r>
+        <w:t xml:space="preserve">. Ovaj</w:t>
+      </w:r>
+      <w:r>
+        <w:t xml:space="preserve"> </w:t>
+      </w:r>
+      <w:r>
+        <w:t xml:space="preserve">princip ne propisuje novi mehanizam kontrole pristupa, već kriterijum za ispravnu upotrebu bilo kog od</w:t>
+      </w:r>
+      <w:r>
+        <w:t xml:space="preserve"> </w:t>
+      </w:r>
+      <w:r>
+        <w:t xml:space="preserve">prethodno opisanih modela: nalog kome je dovoljno pravo čitanja ne treba da poseduje i pravo</w:t>
+      </w:r>
+      <w:r>
+        <w:t xml:space="preserve"> </w:t>
+      </w:r>
+      <w:r>
+        <w:t xml:space="preserve">izmene, uloga zadužena za jedan zadatak ne treba da nosi privilegije potrebne za neki drugi. Isti rad</w:t>
+      </w:r>
+      <w:r>
+        <w:t xml:space="preserve"> </w:t>
+      </w:r>
+      <w:r>
+        <w:t xml:space="preserve">formuliše i princip „bezbednih podrazumevanih vrednosti”: „odluke o pristupu treba zasnivati na</w:t>
+      </w:r>
+      <w:r>
+        <w:t xml:space="preserve"> </w:t>
+      </w:r>
+      <w:r>
+        <w:t xml:space="preserve">dozvoli, a ne na isključenju”</w:t>
+      </w:r>
+      <w:r>
+        <w:t xml:space="preserve"> </w:t>
+      </w:r>
+      <w:r>
+        <w:t xml:space="preserve">[7]</w:t>
+      </w:r>
+      <w:r>
+        <w:t xml:space="preserve">, što je tačan opis grant-only modela kakav ima</w:t>
+      </w:r>
+      <w:r>
+        <w:t xml:space="preserve"> </w:t>
+      </w:r>
+      <w:r>
+        <w:t xml:space="preserve">MySQL, gde odsustvo eksplicitne dodele predstavlja jedini oblik zabrane koji sistem poznaje; ovim se</w:t>
+      </w:r>
+      <w:r>
+        <w:t xml:space="preserve"> </w:t>
+      </w:r>
+      <w:r>
+        <w:t xml:space="preserve">MySQL-ov projektantski izbor oslanja na princip star pola veka, a ne samo na priručnik proizvođača.</w:t>
+      </w:r>
+      <w:r>
+        <w:t xml:space="preserve"> </w:t>
+      </w:r>
+      <w:r>
+        <w:t xml:space="preserve">Princip najmanjih privilegija se u ovom radu ne obrađuje kao posebno poglavlje, već kao nit koja se</w:t>
+      </w:r>
+      <w:r>
+        <w:t xml:space="preserve"> </w:t>
+      </w:r>
+      <w:r>
+        <w:t xml:space="preserve">ponovo imenuje u svakom narednom poglavlju u kojem konkretna projektantska odluka, obim uloge u</w:t>
+      </w:r>
+      <w:r>
+        <w:t xml:space="preserve"> </w:t>
+      </w:r>
+      <w:r>
+        <w:t xml:space="preserve">trećem poglavlju ili šablon izolacije zakupaca u sedmom poglavlju, tu nit čini opipljivom.</w:t>
+      </w:r>
+    </w:p>
+    <w:p>
+      <w:pPr>
+        <w:pStyle w:val="BodyText"/>
+      </w:pPr>
+      <w:r>
+        <w:t xml:space="preserve">Ovo poglavlje postavlja tezu koju svako naredno poglavlje proverava na jednom njenom delu: MySQL-ov</w:t>
+      </w:r>
+      <w:r>
+        <w:t xml:space="preserve"> </w:t>
+      </w:r>
+      <w:r>
+        <w:t xml:space="preserve">sistem privilegija je diskrecion u celini, bez ijednog elementa obavezne kontrole pristupa, dok se</w:t>
+      </w:r>
+      <w:r>
+        <w:t xml:space="preserve"> </w:t>
+      </w:r>
+      <w:r>
+        <w:t xml:space="preserve">savremeniji zahtevi, RBAC u formalnom smislu, bezbednost na nivou reda i izolacija u multi-tenant</w:t>
+      </w:r>
+      <w:r>
+        <w:t xml:space="preserve"> </w:t>
+      </w:r>
+      <w:r>
+        <w:t xml:space="preserve">okruženjima, moraju ili sastaviti od diskrecionih građevnih blokova opisanih u ovom poglavlju, ili</w:t>
+      </w:r>
+      <w:r>
+        <w:t xml:space="preserve"> </w:t>
+      </w:r>
+      <w:r>
+        <w:t xml:space="preserve">priznati kao potpuno odsutni iz same baze podataka.</w:t>
+      </w:r>
+    </w:p>
+    <w:bookmarkStart w:id="23" w:name="refs"/>
+    <w:bookmarkStart w:id="13" w:name="ref-ramakrishnan2003"/>
     <w:p>
       <w:pPr>
         <w:pStyle w:val="Bibliography"/>
@@ -561,8 +1495,8 @@
         <w:t xml:space="preserve">, 3rd ed. New York, NY, USA: McGraw-Hill, 2003.</w:t>
       </w:r>
     </w:p>
-    <w:bookmarkEnd w:id="9"/>
-    <w:bookmarkStart w:id="11" w:name="ref-mysql84refman"/>
+    <w:bookmarkEnd w:id="13"/>
+    <w:bookmarkStart w:id="15" w:name="ref-mysql84refman"/>
     <w:p>
       <w:pPr>
         <w:pStyle w:val="Bibliography"/>
@@ -597,7 +1531,7 @@
       <w:r>
         <w:t xml:space="preserve"> </w:t>
       </w:r>
-      <w:hyperlink r:id="rId10">
+      <w:hyperlink r:id="rId14">
         <w:r>
           <w:rPr>
             <w:rStyle w:val="Hyperlink"/>
@@ -609,8 +1543,8 @@
         <w:t xml:space="preserve">, 2024.</w:t>
       </w:r>
     </w:p>
-    <w:bookmarkEnd w:id="11"/>
-    <w:bookmarkStart w:id="13" w:name="ref-sandhu1996"/>
+    <w:bookmarkEnd w:id="15"/>
+    <w:bookmarkStart w:id="17" w:name="ref-sandhu1996"/>
     <w:p>
       <w:pPr>
         <w:pStyle w:val="Bibliography"/>
@@ -649,7 +1583,7 @@
       <w:r>
         <w:t xml:space="preserve"> </w:t>
       </w:r>
-      <w:hyperlink r:id="rId12">
+      <w:hyperlink r:id="rId16">
         <w:r>
           <w:rPr>
             <w:rStyle w:val="Hyperlink"/>
@@ -661,9 +1595,176 @@
         <w:t xml:space="preserve">.</w:t>
       </w:r>
     </w:p>
-    <w:bookmarkEnd w:id="13"/>
-    <w:bookmarkEnd w:id="14"/>
-    <w:bookmarkEnd w:id="15"/>
+    <w:bookmarkEnd w:id="17"/>
+    <w:bookmarkStart w:id="18" w:name="ref-bell1973"/>
+    <w:p>
+      <w:pPr>
+        <w:pStyle w:val="Bibliography"/>
+      </w:pPr>
+      <w:r>
+        <w:t xml:space="preserve">[4]</w:t>
+      </w:r>
+      <w:r>
+        <w:t xml:space="preserve"> </w:t>
+      </w:r>
+      <w:r>
+        <w:t xml:space="preserve">	</w:t>
+      </w:r>
+      <w:r>
+        <w:t xml:space="preserve">D. E. Bell and L. J. LaPadula,</w:t>
+      </w:r>
+      <w:r>
+        <w:t xml:space="preserve"> </w:t>
+      </w:r>
+      <w:r>
+        <w:t xml:space="preserve">“Secure computer systems: Mathematical foundations,”</w:t>
+      </w:r>
+      <w:r>
+        <w:t xml:space="preserve"> </w:t>
+      </w:r>
+      <w:r>
+        <w:t xml:space="preserve">The MITRE Corporation, Bedford, MA, USA, MTR-2547, Vol. I, 1973.</w:t>
+      </w:r>
+    </w:p>
+    <w:bookmarkEnd w:id="18"/>
+    <w:bookmarkStart w:id="19" w:name="ref-ferraiolokuhn1992"/>
+    <w:p>
+      <w:pPr>
+        <w:pStyle w:val="Bibliography"/>
+      </w:pPr>
+      <w:r>
+        <w:t xml:space="preserve">[5]</w:t>
+      </w:r>
+      <w:r>
+        <w:t xml:space="preserve"> </w:t>
+      </w:r>
+      <w:r>
+        <w:t xml:space="preserve">	</w:t>
+      </w:r>
+      <w:r>
+        <w:t xml:space="preserve">D. F. Ferraiolo and D. R. Kuhn,</w:t>
+      </w:r>
+      <w:r>
+        <w:t xml:space="preserve"> </w:t>
+      </w:r>
+      <w:r>
+        <w:t xml:space="preserve">“Role-based access controls,”</w:t>
+      </w:r>
+      <w:r>
+        <w:t xml:space="preserve"> </w:t>
+      </w:r>
+      <w:r>
+        <w:t xml:space="preserve">in</w:t>
+      </w:r>
+      <w:r>
+        <w:t xml:space="preserve"> </w:t>
+      </w:r>
+      <w:r>
+        <w:rPr>
+          <w:i/>
+          <w:iCs/>
+        </w:rPr>
+        <w:t xml:space="preserve">Proc. 15th national computer security conference (NCSC)</w:t>
+      </w:r>
+      <w:r>
+        <w:t xml:space="preserve">, Baltimore, MD, USA, 1992, pp. 554–563.</w:t>
+      </w:r>
+    </w:p>
+    <w:bookmarkEnd w:id="19"/>
+    <w:bookmarkStart w:id="20" w:name="ref-incits2004"/>
+    <w:p>
+      <w:pPr>
+        <w:pStyle w:val="Bibliography"/>
+      </w:pPr>
+      <w:r>
+        <w:t xml:space="preserve">[6]</w:t>
+      </w:r>
+      <w:r>
+        <w:t xml:space="preserve"> </w:t>
+      </w:r>
+      <w:r>
+        <w:t xml:space="preserve">	</w:t>
+      </w:r>
+      <w:r>
+        <w:t xml:space="preserve">American National Standards Institute and International Committee for Information Technology Standards,</w:t>
+      </w:r>
+      <w:r>
+        <w:t xml:space="preserve"> </w:t>
+      </w:r>
+      <w:r>
+        <w:t xml:space="preserve">“</w:t>
+      </w:r>
+      <w:r>
+        <w:t xml:space="preserve">ANSI/INCITS</w:t>
+      </w:r>
+      <w:r>
+        <w:t xml:space="preserve"> </w:t>
+      </w:r>
+      <w:r>
+        <w:t xml:space="preserve">359-2004: Information technology – role based access control.”</w:t>
+      </w:r>
+      <w:r>
+        <w:t xml:space="preserve"> </w:t>
+      </w:r>
+      <w:r>
+        <w:t xml:space="preserve">ANSI/INCITS Standard, 2004.</w:t>
+      </w:r>
+    </w:p>
+    <w:bookmarkEnd w:id="20"/>
+    <w:bookmarkStart w:id="22" w:name="ref-saltzerschroeder1975"/>
+    <w:p>
+      <w:pPr>
+        <w:pStyle w:val="Bibliography"/>
+      </w:pPr>
+      <w:r>
+        <w:t xml:space="preserve">[7]</w:t>
+      </w:r>
+      <w:r>
+        <w:t xml:space="preserve"> </w:t>
+      </w:r>
+      <w:r>
+        <w:t xml:space="preserve">	</w:t>
+      </w:r>
+      <w:r>
+        <w:t xml:space="preserve">J. H. Saltzer and M. D. Schroeder,</w:t>
+      </w:r>
+      <w:r>
+        <w:t xml:space="preserve"> </w:t>
+      </w:r>
+      <w:r>
+        <w:t xml:space="preserve">“The protection of information in computer systems,”</w:t>
+      </w:r>
+      <w:r>
+        <w:t xml:space="preserve"> </w:t>
+      </w:r>
+      <w:r>
+        <w:rPr>
+          <w:i/>
+          <w:iCs/>
+        </w:rPr>
+        <w:t xml:space="preserve">Proceedings of the IEEE</w:t>
+      </w:r>
+      <w:r>
+        <w:t xml:space="preserve">, vol. 63, no. 9, pp. 1278–1308, 1975, doi:</w:t>
+      </w:r>
+      <w:r>
+        <w:t xml:space="preserve"> </w:t>
+      </w:r>
+      <w:hyperlink r:id="rId21">
+        <w:r>
+          <w:rPr>
+            <w:rStyle w:val="Hyperlink"/>
+          </w:rPr>
+          <w:t xml:space="preserve">10.1109/PROC.1975.9939</w:t>
+        </w:r>
+      </w:hyperlink>
+      <w:r>
+        <w:t xml:space="preserve">.</w:t>
+      </w:r>
+    </w:p>
+    <w:bookmarkEnd w:id="22"/>
+    <w:bookmarkEnd w:id="23"/>
+    <w:bookmarkEnd w:id="24"/>
     <w:sectPr>
       <w:pgSz w:h="16838" w:w="11906"/>
       <w:pgMar w:bottom="1417" w:footer="708" w:gutter="0" w:header="708" w:left="1417" w:right="1417" w:top="1417"/>

</xml_diff>